<commit_message>
Fix blank document pages, integrate user CPV Word templates, dynamic family and office visit verification
</commit_message>
<xml_diff>
--- a/app/report_templates/cpv_1_person.docx
+++ b/app/report_templates/cpv_1_person.docx
@@ -47,7 +47,7 @@
           <w:szCs w:val="28"/>
           <w:u w:val="double"/>
         </w:rPr>
-        <w:t>Type of Loan: [[LOAN_TYPE]]</w:t>
+        <w:t xml:space="preserve">Type of Loan: </w:t>
       </w:r>
     </w:p>
     <w:tbl>
@@ -1227,7 +1227,7 @@
           <w:noProof/>
         </w:rPr>
         <w:lastRenderedPageBreak/>
-        <w:pict w14:anchorId="2B7DEAC6">
+        <w:pict w14:anchorId="14B55CCF">
           <v:rect id="_x0000_s1026" style="position:absolute;left:0;text-align:left;margin-left:98.25pt;margin-top:-6.15pt;width:318.75pt;height:30.75pt;z-index:251658240">
             <v:textbox>
               <w:txbxContent>
@@ -1335,36 +1335,43 @@
         <w:rPr>
           <w:lang w:val="en-GB"/>
         </w:rPr>
-        <w:t>[[RES_1]]</w:t>
+        <w:t xml:space="preserve">A residence verification was conducted for the applicant, </w:t>
       </w:r>
       <w:r>
         <w:rPr>
           <w:highlight w:val="yellow"/>
           <w:lang w:val="en-GB"/>
         </w:rPr>
+        <w:t>Mr. Vishal Dipakbhai Thakar</w:t>
       </w:r>
       <w:r>
         <w:rPr>
           <w:lang w:val="en-GB"/>
         </w:rPr>
+        <w:t xml:space="preserve">, at the following address Viz: </w:t>
       </w:r>
       <w:r>
         <w:rPr>
           <w:highlight w:val="yellow"/>
         </w:rPr>
+        <w:t>C - 1003 &amp; 1004, Royal Heights, Sardar Patel Ring Rd, Khodiyar, Ahmedabad-382501</w:t>
       </w:r>
-      <w:r/>
+      <w:r>
+        <w:t xml:space="preserve">, on </w:t>
+      </w:r>
       <w:r>
         <w:rPr>
           <w:highlight w:val="yellow"/>
           <w:lang w:val="en-GB"/>
         </w:rPr>
+        <w:t>02/05</w:t>
       </w:r>
       <w:r>
         <w:rPr>
           <w:highlight w:val="yellow"/>
           <w:lang w:val="en-GB"/>
         </w:rPr>
+        <w:t>/2026.</w:t>
       </w:r>
     </w:p>
     <w:p>
@@ -1392,36 +1399,43 @@
         <w:rPr>
           <w:lang w:val="en-GB"/>
         </w:rPr>
-        <w:t>[[RES_2]]</w:t>
+        <w:t>During the course of verification</w:t>
       </w:r>
       <w:r>
         <w:rPr>
           <w:lang w:val="en-GB"/>
         </w:rPr>
+        <w:t xml:space="preserve">, the premises were occupied. The verification was carried out through interaction with </w:t>
       </w:r>
       <w:r>
         <w:rPr>
           <w:highlight w:val="yellow"/>
           <w:lang w:val="en-GB"/>
         </w:rPr>
+        <w:t>Mrs Mittal Thakar (Wife of the applicant) she</w:t>
       </w:r>
       <w:r>
         <w:rPr>
           <w:lang w:val="en-GB"/>
         </w:rPr>
+        <w:t xml:space="preserve"> confirmed that they have been residing at the said address for the past </w:t>
       </w:r>
       <w:r>
         <w:rPr>
           <w:highlight w:val="yellow"/>
           <w:lang w:val="en-GB"/>
         </w:rPr>
+        <w:t>07</w:t>
       </w:r>
       <w:r>
         <w:rPr>
           <w:lang w:val="en-GB"/>
         </w:rPr>
+        <w:t xml:space="preserve"> years.</w:t>
       </w:r>
-      <w:r/>
+      <w:r>
+        <w:t xml:space="preserve"> Which appears consistent with the information provided.</w:t>
+      </w:r>
     </w:p>
     <w:p>
       <w:pPr>
@@ -1448,56 +1462,65 @@
         <w:rPr>
           <w:lang w:val="en-GB"/>
         </w:rPr>
-        <w:t>[[RES_3]]</w:t>
+        <w:t>The property is a</w:t>
       </w:r>
       <w:r>
         <w:rPr>
           <w:lang w:val="en-GB"/>
         </w:rPr>
+        <w:t xml:space="preserve"> </w:t>
       </w:r>
       <w:r>
         <w:rPr>
           <w:highlight w:val="yellow"/>
           <w:lang w:val="en-GB"/>
         </w:rPr>
+        <w:t>2</w:t>
       </w:r>
       <w:r>
         <w:rPr>
           <w:lang w:val="en-GB"/>
         </w:rPr>
+        <w:t xml:space="preserve"> BHK</w:t>
       </w:r>
       <w:r>
         <w:rPr>
           <w:lang w:val="en-GB"/>
         </w:rPr>
+        <w:t xml:space="preserve"> </w:t>
       </w:r>
       <w:r>
         <w:rPr>
           <w:highlight w:val="yellow"/>
           <w:lang w:val="en-GB"/>
         </w:rPr>
+        <w:t>Flat</w:t>
       </w:r>
       <w:r>
         <w:rPr>
           <w:highlight w:val="yellow"/>
           <w:lang w:val="en-GB"/>
         </w:rPr>
+        <w:t>/ Independent House</w:t>
       </w:r>
       <w:r>
         <w:rPr>
           <w:lang w:val="en-GB"/>
         </w:rPr>
+        <w:t xml:space="preserve"> and is classified as </w:t>
       </w:r>
       <w:r>
         <w:rPr>
           <w:highlight w:val="yellow"/>
           <w:lang w:val="en-GB"/>
         </w:rPr>
+        <w:t>owned</w:t>
       </w:r>
       <w:r>
         <w:rPr>
           <w:lang w:val="en-GB"/>
         </w:rPr>
+        <w:t>. The surrounding area is residential in nature, and the locality was observed to be developed with adequate infrastructure.</w:t>
       </w:r>
     </w:p>
     <w:p>
@@ -1525,7 +1548,7 @@
         <w:rPr>
           <w:lang w:val="en-GB"/>
         </w:rPr>
-        <w:t>[[RES_4]]</w:t>
+        <w:t>During the course of verification, residence proof indicators, were observed at the premises. Based on physical verification, interaction with occupants, and supporting indicators available at the site, the residential details furnished by the applicant are verified and consistent with the information provided.</w:t>
       </w:r>
     </w:p>
     <w:p>
@@ -1595,91 +1618,106 @@
         <w:rPr>
           <w:lang w:val="en-GB"/>
         </w:rPr>
-        <w:t>[[WORK_1]]</w:t>
+        <w:t>The</w:t>
       </w:r>
       <w:r>
         <w:rPr>
           <w:lang w:val="en-GB"/>
         </w:rPr>
+        <w:t xml:space="preserve"> applicant, </w:t>
       </w:r>
       <w:r>
         <w:rPr>
           <w:highlight w:val="yellow"/>
           <w:lang w:val="en-GB"/>
         </w:rPr>
+        <w:t>Mr Vishal Dipakbhai Thakar</w:t>
       </w:r>
       <w:r>
         <w:rPr>
           <w:lang w:val="en-GB"/>
         </w:rPr>
+        <w:t xml:space="preserve">, </w:t>
       </w:r>
       <w:r>
         <w:rPr>
           <w:highlight w:val="yellow"/>
           <w:lang w:val="en-GB"/>
         </w:rPr>
+        <w:t>is employed</w:t>
       </w:r>
       <w:r>
         <w:rPr>
           <w:highlight w:val="yellow"/>
           <w:lang w:val="en-GB"/>
         </w:rPr>
+        <w:t xml:space="preserve"> with</w:t>
       </w:r>
       <w:r>
         <w:rPr>
           <w:highlight w:val="yellow"/>
           <w:lang w:val="en-GB"/>
         </w:rPr>
+        <w:t xml:space="preserve">/ has a </w:t>
       </w:r>
       <w:r>
         <w:rPr>
           <w:highlight w:val="yellow"/>
           <w:lang w:val="en-GB"/>
         </w:rPr>
+        <w:t>business named</w:t>
       </w:r>
       <w:r>
         <w:rPr>
           <w:lang w:val="en-GB"/>
         </w:rPr>
+        <w:t xml:space="preserve"> </w:t>
       </w:r>
       <w:r>
         <w:rPr>
           <w:highlight w:val="yellow"/>
           <w:lang w:val="en-GB"/>
         </w:rPr>
+        <w:t>XYZ</w:t>
       </w:r>
       <w:r>
         <w:rPr>
           <w:lang w:val="en-GB"/>
         </w:rPr>
+        <w:t xml:space="preserve">, </w:t>
       </w:r>
       <w:r>
         <w:rPr>
           <w:lang w:val="en-GB"/>
         </w:rPr>
+        <w:t xml:space="preserve">located at, </w:t>
       </w:r>
       <w:r>
         <w:rPr>
           <w:highlight w:val="yellow"/>
           <w:lang w:val="en-GB"/>
         </w:rPr>
+        <w:t>12 - Fortune Empire, Borisana Rd, Ambika Nagar, Kalol, Ahmedabad-382721.</w:t>
       </w:r>
       <w:r>
         <w:rPr>
           <w:lang w:val="en-GB"/>
         </w:rPr>
+        <w:t xml:space="preserve"> A physical verification was conducted on </w:t>
       </w:r>
       <w:r>
         <w:rPr>
           <w:highlight w:val="yellow"/>
           <w:lang w:val="en-GB"/>
         </w:rPr>
+        <w:t>02/05</w:t>
       </w:r>
       <w:r>
         <w:rPr>
           <w:highlight w:val="yellow"/>
           <w:lang w:val="en-GB"/>
         </w:rPr>
+        <w:t>/2026.</w:t>
       </w:r>
     </w:p>
     <w:p>
@@ -1708,55 +1746,64 @@
         <w:rPr>
           <w:lang w:val="en-GB"/>
         </w:rPr>
-        <w:t>[[WORK_2]]</w:t>
+        <w:t xml:space="preserve">During the verification, the applicant’s </w:t>
       </w:r>
       <w:r>
         <w:rPr>
           <w:highlight w:val="yellow"/>
           <w:lang w:val="en-GB"/>
         </w:rPr>
+        <w:t>employment details/ business details</w:t>
       </w:r>
       <w:r>
         <w:rPr>
           <w:lang w:val="en-GB"/>
         </w:rPr>
+        <w:t xml:space="preserve"> was</w:t>
       </w:r>
       <w:r>
         <w:rPr>
           <w:lang w:val="en-GB"/>
         </w:rPr>
+        <w:t xml:space="preserve"> confirmed, the applicant is working as a </w:t>
       </w:r>
       <w:r>
         <w:rPr>
           <w:highlight w:val="yellow"/>
           <w:lang w:val="en-GB"/>
         </w:rPr>
+        <w:t>Proprietor</w:t>
       </w:r>
       <w:r>
         <w:rPr>
           <w:lang w:val="en-GB"/>
         </w:rPr>
+        <w:t xml:space="preserve">. The applicant has been associated with the organization </w:t>
       </w:r>
       <w:r>
         <w:rPr>
           <w:lang w:val="en-GB"/>
         </w:rPr>
+        <w:t>for</w:t>
       </w:r>
       <w:r>
         <w:rPr>
           <w:lang w:val="en-GB"/>
         </w:rPr>
+        <w:t xml:space="preserve"> </w:t>
       </w:r>
       <w:r>
         <w:rPr>
           <w:highlight w:val="yellow"/>
           <w:lang w:val="en-GB"/>
         </w:rPr>
+        <w:t>14 years</w:t>
       </w:r>
       <w:r>
         <w:rPr>
           <w:lang w:val="en-GB"/>
         </w:rPr>
+        <w:t xml:space="preserve">. </w:t>
       </w:r>
     </w:p>
     <w:p>
@@ -1784,7 +1831,7 @@
         <w:rPr>
           <w:lang w:val="en-GB"/>
         </w:rPr>
-        <w:t>[[WORK_3]]</w:t>
+        <w:t>Based on the verification conducted, the employment details of the applicant are genuine.</w:t>
       </w:r>
     </w:p>
     <w:p>
@@ -1883,36 +1930,41 @@
           <w:highlight w:val="yellow"/>
           <w:lang w:val="en-GB"/>
         </w:rPr>
-        <w:t>[[ITR_1]]</w:t>
+        <w:t xml:space="preserve">The applicant has submitted Income Tax Returns (ITRs) for the </w:t>
       </w:r>
       <w:r>
         <w:rPr>
           <w:highlight w:val="yellow"/>
           <w:lang w:val="en-GB"/>
         </w:rPr>
+        <w:t>Ass</w:t>
       </w:r>
       <w:r>
         <w:rPr>
           <w:highlight w:val="yellow"/>
           <w:lang w:val="en-GB"/>
         </w:rPr>
+        <w:t>essment</w:t>
       </w:r>
       <w:r>
         <w:rPr>
           <w:highlight w:val="yellow"/>
           <w:lang w:val="en-GB"/>
         </w:rPr>
+        <w:t xml:space="preserve"> years 2023–24, 2024–25 and 2025-26</w:t>
       </w:r>
       <w:r>
         <w:rPr>
           <w:highlight w:val="yellow"/>
           <w:lang w:val="en-GB"/>
         </w:rPr>
+        <w:t>,</w:t>
       </w:r>
       <w:r>
         <w:rPr>
           <w:lang w:val="en-GB"/>
         </w:rPr>
+        <w:t xml:space="preserve"> as proof of income. </w:t>
       </w:r>
     </w:p>
     <w:p>
@@ -1942,12 +1994,13 @@
           <w:highlight w:val="yellow"/>
           <w:lang w:val="en-GB"/>
         </w:rPr>
-        <w:t>[[ITR_2]]</w:t>
+        <w:t>The Form No: 16 A.Y.2025-2026, A.Y.2024-2025, A.Y.2023-2024,</w:t>
       </w:r>
       <w:r>
         <w:rPr>
           <w:lang w:val="en-GB"/>
         </w:rPr>
+        <w:t xml:space="preserve"> Was Provided for Our Verification from Traces Website.</w:t>
       </w:r>
     </w:p>
     <w:p>
@@ -1994,43 +2047,50 @@
         <w:rPr>
           <w:lang w:val="en-GB"/>
         </w:rPr>
-        <w:t>[[KYC_1]]</w:t>
+        <w:t xml:space="preserve">The applicant, </w:t>
       </w:r>
       <w:r>
         <w:rPr>
           <w:lang w:val="en-GB"/>
         </w:rPr>
+        <w:t xml:space="preserve">Mr. </w:t>
       </w:r>
       <w:r>
         <w:rPr>
           <w:highlight w:val="yellow"/>
           <w:lang w:val="en-GB"/>
         </w:rPr>
+        <w:t>Milan Rajeshkumar Rathod</w:t>
       </w:r>
       <w:r>
         <w:rPr>
           <w:lang w:val="en-GB"/>
         </w:rPr>
+        <w:t>,</w:t>
       </w:r>
       <w:r>
         <w:rPr>
           <w:lang w:val="en-GB"/>
         </w:rPr>
+        <w:t xml:space="preserve"> has submitted </w:t>
       </w:r>
       <w:r>
         <w:rPr>
           <w:lang w:val="en-GB"/>
         </w:rPr>
+        <w:t xml:space="preserve">the </w:t>
       </w:r>
       <w:r>
         <w:rPr>
           <w:lang w:val="en-GB"/>
         </w:rPr>
+        <w:t>KYC documents</w:t>
       </w:r>
       <w:r>
         <w:rPr>
           <w:lang w:val="en-GB"/>
         </w:rPr>
+        <w:t xml:space="preserve">. </w:t>
       </w:r>
     </w:p>
     <w:p>
@@ -6138,7 +6198,7 @@
           <w:b/>
           <w:bCs/>
         </w:rPr>
-        <w:t>[[ITR_NAME_1]]</w:t>
+        <w:t>Mr</w:t>
       </w:r>
     </w:p>
     <w:tbl>
@@ -6773,7 +6833,7 @@
           <w:bCs/>
           <w:u w:val="thick"/>
         </w:rPr>
-        <w:t>Name: [[BANK_NAME_1]]</w:t>
+        <w:t>Name:</w:t>
       </w:r>
       <w:r>
         <w:rPr>
@@ -6783,6 +6843,7 @@
           <w:sz w:val="28"/>
           <w:szCs w:val="28"/>
         </w:rPr>
+        <w:t xml:space="preserve"> </w:t>
       </w:r>
       <w:r>
         <w:rPr>
@@ -6790,6 +6851,7 @@
           <w:b/>
           <w:bCs/>
         </w:rPr>
+        <w:t>Mr</w:t>
       </w:r>
     </w:p>
     <w:tbl>
@@ -7142,7 +7204,7 @@
         <w:rPr>
           <w:noProof/>
         </w:rPr>
-        <w:pict w14:anchorId="18A467DA">
+        <w:pict w14:anchorId="0CB6208F">
           <v:roundrect id="_x0000_s1027" style="position:absolute;left:0;text-align:left;margin-left:69.85pt;margin-top:-27.45pt;width:372.15pt;height:37.4pt;z-index:251659264" arcsize="10923f">
             <v:textbox style="mso-next-textbox:#_x0000_s1027">
               <w:txbxContent>
@@ -7491,7 +7553,7 @@
         <w:rPr>
           <w:noProof/>
         </w:rPr>
-        <w:pict w14:anchorId="7630D954">
+        <w:pict w14:anchorId="420BD0A3">
           <v:roundrect id="_x0000_s1028" style="position:absolute;left:0;text-align:left;margin-left:84.45pt;margin-top:-27.3pt;width:345.05pt;height:33.65pt;z-index:251661312" arcsize="10923f">
             <v:textbox>
               <w:txbxContent>
@@ -7802,7 +7864,7 @@
         <w:rPr>
           <w:noProof/>
         </w:rPr>
-        <w:pict w14:anchorId="4B0E6220">
+        <w:pict w14:anchorId="5A4FCA04">
           <v:roundrect id="_x0000_s1029" style="position:absolute;left:0;text-align:left;margin-left:85.2pt;margin-top:-28.3pt;width:325.4pt;height:30.85pt;z-index:251662336" arcsize="10923f">
             <v:textbox>
               <w:txbxContent>
@@ -8351,12 +8413,36 @@
               <w:rPr>
                 <w:noProof/>
               </w:rPr>
-              <w:t xml:space="preserve">                                              [[SIGNATURE]]</w:t>
+              <w:t xml:space="preserve">                                              </w:t>
             </w:r>
             <w:r>
               <w:rPr>
                 <w:noProof/>
               </w:rPr>
+              <w:pict w14:anchorId="4205DC43">
+                <v:shapetype id="_x0000_t75" coordsize="21600,21600" o:spt="75" o:preferrelative="t" path="m@4@5l@4@11@9@11@9@5xe" filled="f" stroked="f">
+                  <v:stroke joinstyle="miter"/>
+                  <v:formulas>
+                    <v:f eqn="if lineDrawn pixelLineWidth 0"/>
+                    <v:f eqn="sum @0 1 0"/>
+                    <v:f eqn="sum 0 0 @1"/>
+                    <v:f eqn="prod @2 1 2"/>
+                    <v:f eqn="prod @3 21600 pixelWidth"/>
+                    <v:f eqn="prod @3 21600 pixelHeight"/>
+                    <v:f eqn="sum @0 0 1"/>
+                    <v:f eqn="prod @6 1 2"/>
+                    <v:f eqn="prod @7 21600 pixelWidth"/>
+                    <v:f eqn="sum @8 21600 0"/>
+                    <v:f eqn="prod @7 21600 pixelHeight"/>
+                    <v:f eqn="sum @10 21600 0"/>
+                  </v:formulas>
+                  <v:path o:extrusionok="f" gradientshapeok="t" o:connecttype="rect"/>
+                  <o:lock v:ext="edit" aspectratio="t"/>
+                </v:shapetype>
+                <v:shape id="Picture 1" o:spid="_x0000_i1027" type="#_x0000_t75" style="width:159pt;height:44.4pt;visibility:visible">
+                  <v:imagedata r:id="rId8" o:title=""/>
+                </v:shape>
+              </w:pict>
             </w:r>
           </w:p>
           <w:p>
@@ -8485,7 +8571,7 @@
                 <w:sz w:val="21"/>
                 <w:szCs w:val="21"/>
               </w:rPr>
-              <w:t xml:space="preserve">                                                              UDIN: [[UDIN]]</w:t>
+              <w:t xml:space="preserve">                                  </w:t>
             </w:r>
             <w:r>
               <w:rPr>
@@ -8494,6 +8580,7 @@
                 <w:sz w:val="21"/>
                 <w:szCs w:val="21"/>
               </w:rPr>
+              <w:t xml:space="preserve">                      </w:t>
             </w:r>
             <w:r>
               <w:rPr>
@@ -8502,6 +8589,7 @@
                 <w:sz w:val="21"/>
                 <w:szCs w:val="21"/>
               </w:rPr>
+              <w:t xml:space="preserve">   </w:t>
             </w:r>
             <w:r>
               <w:rPr>
@@ -8510,6 +8598,7 @@
                 <w:sz w:val="21"/>
                 <w:szCs w:val="21"/>
               </w:rPr>
+              <w:t xml:space="preserve">   </w:t>
             </w:r>
             <w:r>
               <w:rPr>
@@ -8518,6 +8607,7 @@
                 <w:sz w:val="21"/>
                 <w:szCs w:val="21"/>
               </w:rPr>
+              <w:t>UDIN:</w:t>
             </w:r>
           </w:p>
           <w:p>
@@ -8585,7 +8675,7 @@
                 <w:sz w:val="21"/>
                 <w:szCs w:val="21"/>
               </w:rPr>
-              <w:t>Place: [[CERT_PLACE]]</w:t>
+              <w:t>Place: Ahmedabad</w:t>
             </w:r>
           </w:p>
           <w:p>
@@ -8605,7 +8695,7 @@
                 <w:sz w:val="21"/>
                 <w:szCs w:val="21"/>
               </w:rPr>
-              <w:t>Date: [[CERT_DATE]]</w:t>
+              <w:t>Date:</w:t>
             </w:r>
             <w:r>
               <w:rPr>
@@ -8615,6 +8705,7 @@
                 <w:sz w:val="21"/>
                 <w:szCs w:val="21"/>
               </w:rPr>
+              <w:t xml:space="preserve"> </w:t>
             </w:r>
             <w:r>
               <w:rPr>
@@ -8624,6 +8715,7 @@
                 <w:sz w:val="21"/>
                 <w:szCs w:val="21"/>
               </w:rPr>
+              <w:t>00</w:t>
             </w:r>
             <w:r>
               <w:rPr>
@@ -8633,6 +8725,7 @@
                 <w:sz w:val="21"/>
                 <w:szCs w:val="21"/>
               </w:rPr>
+              <w:t>/</w:t>
             </w:r>
             <w:r>
               <w:rPr>
@@ -8642,6 +8735,7 @@
                 <w:sz w:val="21"/>
                 <w:szCs w:val="21"/>
               </w:rPr>
+              <w:t>0</w:t>
             </w:r>
             <w:r>
               <w:rPr>
@@ -8651,6 +8745,7 @@
                 <w:sz w:val="21"/>
                 <w:szCs w:val="21"/>
               </w:rPr>
+              <w:t>0</w:t>
             </w:r>
             <w:r>
               <w:rPr>
@@ -8660,6 +8755,7 @@
                 <w:sz w:val="21"/>
                 <w:szCs w:val="21"/>
               </w:rPr>
+              <w:t>/202</w:t>
             </w:r>
             <w:r>
               <w:rPr>
@@ -8669,6 +8765,7 @@
                 <w:sz w:val="21"/>
                 <w:szCs w:val="21"/>
               </w:rPr>
+              <w:t>6</w:t>
             </w:r>
           </w:p>
           <w:p>
@@ -8892,7 +8989,7 @@
                 <w:sz w:val="21"/>
                 <w:szCs w:val="21"/>
               </w:rPr>
-              <w:t xml:space="preserve">Date: </w:t>
+              <w:t>Date:</w:t>
             </w:r>
             <w:r>
               <w:rPr>
@@ -8902,6 +8999,7 @@
                 <w:sz w:val="21"/>
                 <w:szCs w:val="21"/>
               </w:rPr>
+              <w:t xml:space="preserve"> </w:t>
             </w:r>
             <w:r>
               <w:rPr>
@@ -8911,6 +9009,7 @@
                 <w:sz w:val="21"/>
                 <w:szCs w:val="21"/>
               </w:rPr>
+              <w:t>00</w:t>
             </w:r>
             <w:r>
               <w:rPr>
@@ -8920,6 +9019,7 @@
                 <w:sz w:val="21"/>
                 <w:szCs w:val="21"/>
               </w:rPr>
+              <w:t>/0</w:t>
             </w:r>
             <w:r>
               <w:rPr>
@@ -8929,6 +9029,7 @@
                 <w:sz w:val="21"/>
                 <w:szCs w:val="21"/>
               </w:rPr>
+              <w:t>0</w:t>
             </w:r>
             <w:r>
               <w:rPr>
@@ -8938,6 +9039,7 @@
                 <w:sz w:val="21"/>
                 <w:szCs w:val="21"/>
               </w:rPr>
+              <w:t>/202</w:t>
             </w:r>
             <w:r>
               <w:rPr>
@@ -8947,6 +9049,7 @@
                 <w:sz w:val="21"/>
                 <w:szCs w:val="21"/>
               </w:rPr>
+              <w:t>6</w:t>
             </w:r>
           </w:p>
           <w:p>
@@ -9114,7 +9217,7 @@
         <w:noProof/>
         <w:kern w:val="0"/>
       </w:rPr>
-      <w:pict w14:anchorId="085E2AC6">
+      <w:pict w14:anchorId="1BF01998">
         <v:shapetype id="_x0000_t75" coordsize="21600,21600" o:spt="75" o:preferrelative="t" path="m@4@5l@4@11@9@11@9@5xe" filled="f" stroked="f">
           <v:stroke joinstyle="miter"/>
           <v:formulas>
@@ -10052,25 +10155,25 @@
       </w:rPr>
     </w:lvl>
   </w:abstractNum>
-  <w:num w:numId="1" w16cid:durableId="298613070">
+  <w:num w:numId="1" w16cid:durableId="2088723853">
     <w:abstractNumId w:val="4"/>
   </w:num>
-  <w:num w:numId="2" w16cid:durableId="2071614539">
+  <w:num w:numId="2" w16cid:durableId="811292194">
     <w:abstractNumId w:val="5"/>
   </w:num>
-  <w:num w:numId="3" w16cid:durableId="2041466662">
+  <w:num w:numId="3" w16cid:durableId="588194555">
     <w:abstractNumId w:val="0"/>
   </w:num>
-  <w:num w:numId="4" w16cid:durableId="609967402">
+  <w:num w:numId="4" w16cid:durableId="771781616">
     <w:abstractNumId w:val="1"/>
   </w:num>
-  <w:num w:numId="5" w16cid:durableId="1704401931">
+  <w:num w:numId="5" w16cid:durableId="101656928">
     <w:abstractNumId w:val="2"/>
   </w:num>
-  <w:num w:numId="6" w16cid:durableId="204030566">
+  <w:num w:numId="6" w16cid:durableId="357632615">
     <w:abstractNumId w:val="3"/>
   </w:num>
-  <w:num w:numId="7" w16cid:durableId="2112970563">
+  <w:num w:numId="7" w16cid:durableId="1207448362">
     <w:abstractNumId w:val="1"/>
     <w:lvlOverride w:ilvl="0"/>
     <w:lvlOverride w:ilvl="1"/>
@@ -10082,7 +10185,7 @@
     <w:lvlOverride w:ilvl="7"/>
     <w:lvlOverride w:ilvl="8"/>
   </w:num>
-  <w:num w:numId="8" w16cid:durableId="1467090517">
+  <w:num w:numId="8" w16cid:durableId="429854754">
     <w:abstractNumId w:val="2"/>
     <w:lvlOverride w:ilvl="0"/>
     <w:lvlOverride w:ilvl="1"/>

</xml_diff>